<commit_message>
DOCS: Mise à jour du dossier de déploiement
Le dossier de déploiement a été mis à jour, compte tenu de l'avancement du projet.
</commit_message>
<xml_diff>
--- a/DossierConception/DossierDeploiement.docx
+++ b/DossierConception/DossierDeploiement.docx
@@ -87,7 +87,7 @@
         <w:jc w:val="both"/>
       </w:pPr>
       <w:r>
-        <w:t>Selenium</w:t>
+        <w:t>Hibernate</w:t>
       </w:r>
     </w:p>
     <w:p>
@@ -99,7 +99,19 @@
         <w:jc w:val="both"/>
       </w:pPr>
       <w:r>
-        <w:t>Hibernate</w:t>
+        <w:t>Maven</w:t>
+      </w:r>
+    </w:p>
+    <w:p>
+      <w:pPr>
+        <w:numPr>
+          <w:ilvl w:val="0"/>
+          <w:numId w:val="1"/>
+        </w:numPr>
+        <w:jc w:val="both"/>
+      </w:pPr>
+      <w:r>
+        <w:t>Front:</w:t>
       </w:r>
     </w:p>
     <w:p>
@@ -111,19 +123,7 @@
         <w:jc w:val="both"/>
       </w:pPr>
       <w:r>
-        <w:t>Maven</w:t>
-      </w:r>
-    </w:p>
-    <w:p>
-      <w:pPr>
-        <w:numPr>
-          <w:ilvl w:val="0"/>
-          <w:numId w:val="1"/>
-        </w:numPr>
-        <w:jc w:val="both"/>
-      </w:pPr>
-      <w:r>
-        <w:t>Front:</w:t>
+        <w:t>HTML5</w:t>
       </w:r>
     </w:p>
     <w:p>
@@ -135,7 +135,7 @@
         <w:jc w:val="both"/>
       </w:pPr>
       <w:r>
-        <w:t>HTML5</w:t>
+        <w:t>CSS3</w:t>
       </w:r>
     </w:p>
     <w:p>
@@ -147,7 +147,7 @@
         <w:jc w:val="both"/>
       </w:pPr>
       <w:r>
-        <w:t>CSS3</w:t>
+        <w:t>JavaScript</w:t>
       </w:r>
     </w:p>
     <w:p>
@@ -159,7 +159,7 @@
         <w:jc w:val="both"/>
       </w:pPr>
       <w:r>
-        <w:t>JavaScript</w:t>
+        <w:t>BootStrap 5.3.8</w:t>
       </w:r>
     </w:p>
     <w:p>
@@ -171,7 +171,7 @@
         <w:jc w:val="both"/>
       </w:pPr>
       <w:r>
-        <w:t>BootStrap 5.3.8</w:t>
+        <w:t>Thymeleaf</w:t>
       </w:r>
     </w:p>
     <w:p>
@@ -195,7 +195,13 @@
         <w:jc w:val="both"/>
       </w:pPr>
       <w:r>
-        <w:t>Lors de la récupération du projet depuis GitHub, quelques étapes sont nécessaires au bon fonctionnement du projet :</w:t>
+        <w:t xml:space="preserve">Lors de la récupération du projet depuis GitHub, quelques étapes </w:t>
+      </w:r>
+      <w:r>
+        <w:t xml:space="preserve">sur un terminal </w:t>
+      </w:r>
+      <w:r>
+        <w:t>sont nécessaires au bon fonctionnement du projet :</w:t>
       </w:r>
     </w:p>
     <w:p>
@@ -220,15 +226,7 @@
           <w:iCs/>
           <w:lang w:val="fr-FR"/>
         </w:rPr>
-        <w:t>mvn dependency:resolve</w:t>
-      </w:r>
-      <w:r>
-        <w:rPr>
-          <w:i/>
-          <w:iCs/>
-          <w:lang w:val="fr-FR"/>
-        </w:rPr>
-        <w:t> </w:t>
+        <w:t>mvn dependency:resolve </w:t>
       </w:r>
       <w:r>
         <w:rPr>
@@ -298,6 +296,24 @@
     </w:p>
     <w:p>
       <w:pPr>
+        <w:spacing w:after="160" w:line="278" w:lineRule="auto"/>
+        <w:jc w:val="both"/>
+        <w:rPr>
+          <w:lang w:val="fr-FR"/>
+        </w:rPr>
+      </w:pPr>
+    </w:p>
+    <w:p>
+      <w:pPr>
+        <w:pStyle w:val="Sous-titre"/>
+        <w:jc w:val="both"/>
+      </w:pPr>
+      <w:r>
+        <w:t>Build du projet :</w:t>
+      </w:r>
+    </w:p>
+    <w:p>
+      <w:pPr>
         <w:pStyle w:val="Paragraphedeliste"/>
         <w:spacing w:after="160" w:line="278" w:lineRule="auto"/>
         <w:ind w:left="0"/>
@@ -307,6 +323,227 @@
         </w:rPr>
       </w:pPr>
       <w:r>
+        <w:rPr>
+          <w:lang w:val="fr-FR"/>
+        </w:rPr>
+        <w:t>L</w:t>
+      </w:r>
+      <w:r>
+        <w:rPr>
+          <w:lang w:val="fr-FR"/>
+        </w:rPr>
+        <w:t xml:space="preserve">a build peut s’effectuer depuis n’importe quel OS, du moment que celui-ci possède JDK25 </w:t>
+      </w:r>
+      <w:r>
+        <w:rPr>
+          <w:lang w:val="fr-FR"/>
+        </w:rPr>
+        <w:t>et Maven d’installé</w:t>
+      </w:r>
+      <w:r>
+        <w:rPr>
+          <w:lang w:val="fr-FR"/>
+        </w:rPr>
+        <w:t>s</w:t>
+      </w:r>
+      <w:r>
+        <w:rPr>
+          <w:lang w:val="fr-FR"/>
+        </w:rPr>
+        <w:t>.</w:t>
+      </w:r>
+      <w:bookmarkStart w:id="0" w:name="_dop03bxbhpa8" w:colFirst="0" w:colLast="0"/>
+      <w:bookmarkEnd w:id="0"/>
+      <w:r>
+        <w:rPr>
+          <w:lang w:val="fr-FR"/>
+        </w:rPr>
+        <w:t xml:space="preserve"> Le build depuis la racine du projet peut être effectuer avec la commande</w:t>
+      </w:r>
+      <w:r>
+        <w:rPr>
+          <w:lang w:val="fr-FR"/>
+        </w:rPr>
+        <w:t xml:space="preserve"> « </w:t>
+      </w:r>
+      <w:r>
+        <w:rPr>
+          <w:i/>
+          <w:iCs/>
+          <w:lang w:val="fr-FR"/>
+        </w:rPr>
+        <w:t>mvn clean package</w:t>
+      </w:r>
+      <w:r>
+        <w:rPr>
+          <w:lang w:val="fr-FR"/>
+        </w:rPr>
+        <w:t> ».</w:t>
+      </w:r>
+    </w:p>
+    <w:p>
+      <w:pPr>
+        <w:pStyle w:val="Paragraphedeliste"/>
+        <w:spacing w:after="160" w:line="278" w:lineRule="auto"/>
+        <w:ind w:left="0"/>
+        <w:jc w:val="both"/>
+        <w:rPr>
+          <w:lang w:val="fr-FR"/>
+        </w:rPr>
+      </w:pPr>
+      <w:r>
+        <w:rPr>
+          <w:lang w:val="fr-FR"/>
+        </w:rPr>
+        <w:t>Le build du projet en .JAR du projet sera disponible dans le dossier « </w:t>
+      </w:r>
+      <w:r>
+        <w:rPr>
+          <w:i/>
+          <w:iCs/>
+          <w:lang w:val="fr-FR"/>
+        </w:rPr>
+        <w:t>target</w:t>
+      </w:r>
+      <w:r>
+        <w:rPr>
+          <w:lang w:val="fr-FR"/>
+        </w:rPr>
+        <w:t> » du projet.</w:t>
+      </w:r>
+    </w:p>
+    <w:p>
+      <w:pPr>
+        <w:pStyle w:val="Paragraphedeliste"/>
+        <w:spacing w:after="160" w:line="278" w:lineRule="auto"/>
+        <w:ind w:left="0"/>
+        <w:jc w:val="both"/>
+        <w:rPr>
+          <w:lang w:val="fr-FR"/>
+        </w:rPr>
+      </w:pPr>
+    </w:p>
+    <w:p>
+      <w:pPr>
+        <w:pStyle w:val="Sous-titre"/>
+        <w:jc w:val="both"/>
+      </w:pPr>
+      <w:r>
+        <w:t xml:space="preserve">Lancement du </w:t>
+      </w:r>
+      <w:r>
+        <w:t>programme</w:t>
+      </w:r>
+      <w:r>
+        <w:t> :</w:t>
+      </w:r>
+    </w:p>
+    <w:p>
+      <w:pPr>
+        <w:pStyle w:val="Paragraphedeliste"/>
+        <w:spacing w:after="160" w:line="278" w:lineRule="auto"/>
+        <w:ind w:left="0"/>
+        <w:jc w:val="both"/>
+        <w:rPr>
+          <w:lang w:val="fr-FR"/>
+        </w:rPr>
+      </w:pPr>
+      <w:r>
+        <w:rPr>
+          <w:lang w:val="fr-FR"/>
+        </w:rPr>
+        <w:t>Le lancement se fait avec la commande « </w:t>
+      </w:r>
+      <w:r>
+        <w:rPr>
+          <w:i/>
+          <w:iCs/>
+          <w:lang w:val="fr-FR"/>
+        </w:rPr>
+        <w:t>mvn spring-boot:run</w:t>
+      </w:r>
+      <w:r>
+        <w:rPr>
+          <w:lang w:val="fr-FR"/>
+        </w:rPr>
+        <w:t> » dans un terminal. Pour clore l’application, il faudra faire Ctrl+C sur le clavier et confirmer la fermeture.</w:t>
+      </w:r>
+    </w:p>
+    <w:p>
+      <w:pPr>
+        <w:pStyle w:val="Paragraphedeliste"/>
+        <w:spacing w:after="160" w:line="278" w:lineRule="auto"/>
+        <w:ind w:left="0"/>
+        <w:jc w:val="both"/>
+        <w:rPr>
+          <w:lang w:val="fr-FR"/>
+        </w:rPr>
+      </w:pPr>
+      <w:r>
+        <w:rPr>
+          <w:lang w:val="fr-FR"/>
+        </w:rPr>
+        <w:t>Le port utilisé par l’application est le 9001</w:t>
+      </w:r>
+      <w:r>
+        <w:rPr>
+          <w:lang w:val="fr-FR"/>
+        </w:rPr>
+        <w:t xml:space="preserve"> (modifiable dans le fichier</w:t>
+      </w:r>
+      <w:r>
+        <w:rPr>
+          <w:lang w:val="fr-FR"/>
+        </w:rPr>
+        <w:t xml:space="preserve"> « </w:t>
+      </w:r>
+      <w:r>
+        <w:rPr>
+          <w:i/>
+          <w:iCs/>
+          <w:lang w:val="fr-FR"/>
+        </w:rPr>
+        <w:t>HarmoGestion_web/src/main/ressources/application.properties</w:t>
+      </w:r>
+      <w:r>
+        <w:rPr>
+          <w:lang w:val="fr-FR"/>
+        </w:rPr>
+        <w:t> »)</w:t>
+      </w:r>
+      <w:r>
+        <w:rPr>
+          <w:lang w:val="fr-FR"/>
+        </w:rPr>
+        <w:t>.</w:t>
+      </w:r>
+      <w:r>
+        <w:rPr>
+          <w:lang w:val="fr-FR"/>
+        </w:rPr>
+        <w:t xml:space="preserve"> Pour lancer l’application dans un navigateur, il faudra écrire « </w:t>
+      </w:r>
+      <w:r>
+        <w:rPr>
+          <w:i/>
+          <w:iCs/>
+          <w:lang w:val="fr-FR"/>
+        </w:rPr>
+        <w:t>localhost:9001</w:t>
+      </w:r>
+      <w:r>
+        <w:rPr>
+          <w:lang w:val="fr-FR"/>
+        </w:rPr>
+        <w:t> » dans la barre d’adresse.</w:t>
+      </w:r>
+    </w:p>
+    <w:p>
+      <w:pPr>
+        <w:pStyle w:val="Paragraphedeliste"/>
+        <w:spacing w:after="160" w:line="278" w:lineRule="auto"/>
+        <w:ind w:left="0"/>
+        <w:jc w:val="both"/>
         <w:rPr>
           <w:b/>
           <w:bCs/>
@@ -314,8 +551,7 @@
           <w:highlight w:val="red"/>
           <w:lang w:val="fr-FR"/>
         </w:rPr>
-        <w:t>/!\</w:t>
-      </w:r>
+      </w:pPr>
       <w:r>
         <w:rPr>
           <w:b/>
@@ -324,7 +560,7 @@
           <w:highlight w:val="red"/>
           <w:lang w:val="fr-FR"/>
         </w:rPr>
-        <w:t xml:space="preserve"> Utiliser cmd ou le terminal d’IntelliJ pour récupérer les dépendances, PowerShell ne fonctionnera pas. /!</w:t>
+        <w:t>/!\</w:t>
       </w:r>
       <w:r>
         <w:rPr>
@@ -334,87 +570,48 @@
           <w:highlight w:val="red"/>
           <w:lang w:val="fr-FR"/>
         </w:rPr>
+        <w:t xml:space="preserve"> Pour fonctionner, l’API doit être lancée</w:t>
+      </w:r>
+      <w:r>
+        <w:rPr>
+          <w:b/>
+          <w:bCs/>
+          <w:color w:val="FFFFFF" w:themeColor="background1"/>
+          <w:highlight w:val="red"/>
+          <w:lang w:val="fr-FR"/>
+        </w:rPr>
+        <w:t xml:space="preserve"> /!</w:t>
+      </w:r>
+      <w:r>
+        <w:rPr>
+          <w:b/>
+          <w:bCs/>
+          <w:color w:val="FFFFFF" w:themeColor="background1"/>
+          <w:highlight w:val="red"/>
+          <w:lang w:val="fr-FR"/>
+        </w:rPr>
         <w:t>\</w:t>
       </w:r>
     </w:p>
     <w:p>
       <w:pPr>
-        <w:pStyle w:val="Paragraphedeliste"/>
         <w:spacing w:after="160" w:line="278" w:lineRule="auto"/>
-        <w:ind w:left="0"/>
-        <w:jc w:val="both"/>
-        <w:rPr>
-          <w:lang w:val="fr-FR"/>
-        </w:rPr>
-      </w:pPr>
-    </w:p>
-    <w:p>
-      <w:pPr>
-        <w:pStyle w:val="Sous-titre"/>
-        <w:jc w:val="both"/>
-      </w:pPr>
-      <w:r>
-        <w:t>Build du projet</w:t>
-      </w:r>
-      <w:r>
-        <w:t> :</w:t>
-      </w:r>
-    </w:p>
-    <w:p>
-      <w:pPr>
-        <w:pStyle w:val="Paragraphedeliste"/>
-        <w:spacing w:after="160" w:line="278" w:lineRule="auto"/>
-        <w:ind w:left="0"/>
-        <w:jc w:val="both"/>
-        <w:rPr>
-          <w:lang w:val="fr-FR"/>
-        </w:rPr>
-      </w:pPr>
-      <w:r>
-        <w:rPr>
-          <w:lang w:val="fr-FR"/>
-        </w:rPr>
-        <w:t>L</w:t>
-      </w:r>
-      <w:r>
-        <w:rPr>
-          <w:lang w:val="fr-FR"/>
-        </w:rPr>
-        <w:t>a build peut s’effectuer depuis n’importe quel OS, du moment que celui-ci possède JDK25 d’installé.</w:t>
-      </w:r>
-    </w:p>
-    <w:p>
-      <w:pPr>
-        <w:pStyle w:val="Paragraphedeliste"/>
-        <w:spacing w:after="160" w:line="278" w:lineRule="auto"/>
-        <w:ind w:left="0"/>
-        <w:jc w:val="both"/>
-        <w:rPr>
-          <w:i/>
-          <w:iCs/>
-          <w:lang w:val="fr-FR"/>
-        </w:rPr>
-      </w:pPr>
-      <w:r>
-        <w:rPr>
-          <w:i/>
-          <w:iCs/>
-          <w:lang w:val="fr-FR"/>
-        </w:rPr>
-        <w:t>À compléter après le cours avec Jérome sur la démarche DevOPS.</w:t>
-      </w:r>
-    </w:p>
-    <w:p>
-      <w:pPr>
-        <w:pStyle w:val="Paragraphedeliste"/>
-        <w:numPr>
-          <w:ilvl w:val="0"/>
-          <w:numId w:val="2"/>
-        </w:numPr>
-        <w:spacing w:after="160" w:line="278" w:lineRule="auto"/>
-        <w:jc w:val="both"/>
-      </w:pPr>
-      <w:r>
+        <w:rPr>
+          <w:b/>
+          <w:bCs/>
+          <w:color w:val="FFFFFF" w:themeColor="background1"/>
+          <w:highlight w:val="red"/>
+          <w:lang w:val="fr-FR"/>
+        </w:rPr>
+      </w:pPr>
+      <w:r>
+        <w:rPr>
+          <w:b/>
+          <w:bCs/>
+          <w:color w:val="FFFFFF" w:themeColor="background1"/>
+          <w:highlight w:val="red"/>
+          <w:lang w:val="fr-FR"/>
+        </w:rPr>
         <w:br w:type="page"/>
       </w:r>
     </w:p>
@@ -423,14 +620,9 @@
         <w:pStyle w:val="Titre"/>
         <w:jc w:val="both"/>
       </w:pPr>
-      <w:bookmarkStart w:id="0" w:name="_dop03bxbhpa8" w:colFirst="0" w:colLast="0"/>
-      <w:bookmarkEnd w:id="0"/>
       <w:r>
         <w:lastRenderedPageBreak/>
-        <w:t>Déploiement côté API</w:t>
-      </w:r>
-      <w:r>
-        <w:t>:</w:t>
+        <w:t>Déploiement côté API:</w:t>
       </w:r>
     </w:p>
     <w:p>
@@ -475,7 +667,7 @@
         <w:jc w:val="both"/>
       </w:pPr>
       <w:r>
-        <w:t>Selenium</w:t>
+        <w:t>MySQL 8.4</w:t>
       </w:r>
     </w:p>
     <w:p>
@@ -487,7 +679,7 @@
         <w:jc w:val="both"/>
       </w:pPr>
       <w:r>
-        <w:t>MySQL 8.4</w:t>
+        <w:t>Hibernate</w:t>
       </w:r>
     </w:p>
     <w:p>
@@ -499,18 +691,6 @@
         <w:jc w:val="both"/>
       </w:pPr>
       <w:r>
-        <w:t>Hibernate</w:t>
-      </w:r>
-    </w:p>
-    <w:p>
-      <w:pPr>
-        <w:numPr>
-          <w:ilvl w:val="0"/>
-          <w:numId w:val="1"/>
-        </w:numPr>
-        <w:jc w:val="both"/>
-      </w:pPr>
-      <w:r>
         <w:t>Maven</w:t>
       </w:r>
     </w:p>
@@ -531,6 +711,9 @@
     <w:p>
       <w:pPr>
         <w:jc w:val="both"/>
+        <w:rPr>
+          <w:lang w:val="fr-FR"/>
+        </w:rPr>
       </w:pPr>
       <w:r>
         <w:t>Afin d’être fonctionnel, il faudra</w:t>
@@ -539,10 +722,7 @@
         <w:t xml:space="preserve"> </w:t>
       </w:r>
       <w:r>
-        <w:t>r</w:t>
-      </w:r>
-      <w:r>
-        <w:t>écupérer les dépendances Maven via la commande « </w:t>
+        <w:t>récupérer les dépendances Maven via la commande « </w:t>
       </w:r>
       <w:r>
         <w:rPr>
@@ -576,6 +756,9 @@
     <w:p>
       <w:pPr>
         <w:jc w:val="both"/>
+        <w:rPr>
+          <w:lang w:val="fr-FR"/>
+        </w:rPr>
       </w:pPr>
     </w:p>
     <w:p>
@@ -584,7 +767,253 @@
         <w:jc w:val="both"/>
       </w:pPr>
       <w:r>
-        <w:t>Build du projet :</w:t>
+        <w:t>Base de données :</w:t>
+      </w:r>
+    </w:p>
+    <w:p>
+      <w:pPr>
+        <w:jc w:val="both"/>
+        <w:rPr>
+          <w:lang w:val="fr-FR"/>
+        </w:rPr>
+      </w:pPr>
+      <w:r>
+        <w:rPr>
+          <w:lang w:val="fr-FR"/>
+        </w:rPr>
+        <w:t>L</w:t>
+      </w:r>
+      <w:r>
+        <w:rPr>
+          <w:lang w:val="fr-FR"/>
+        </w:rPr>
+        <w:t xml:space="preserve">a base de données doit être initialisée avec MySQL avec le script </w:t>
+      </w:r>
+      <w:r>
+        <w:rPr>
+          <w:i/>
+          <w:iCs/>
+          <w:lang w:val="fr-FR"/>
+        </w:rPr>
+        <w:t>ScriptCreationBDD.sql</w:t>
+      </w:r>
+      <w:r>
+        <w:rPr>
+          <w:lang w:val="fr-FR"/>
+        </w:rPr>
+        <w:t xml:space="preserve"> contenu dans le dossier </w:t>
+      </w:r>
+      <w:r>
+        <w:rPr>
+          <w:i/>
+          <w:iCs/>
+          <w:lang w:val="fr-FR"/>
+        </w:rPr>
+        <w:t>DossierConception/SQL</w:t>
+      </w:r>
+      <w:r>
+        <w:rPr>
+          <w:lang w:val="fr-FR"/>
+        </w:rPr>
+        <w:t xml:space="preserve"> du repository </w:t>
+      </w:r>
+      <w:r>
+        <w:rPr>
+          <w:i/>
+          <w:iCs/>
+          <w:lang w:val="fr-FR"/>
+        </w:rPr>
+        <w:t>HarmoGestion_web</w:t>
+      </w:r>
+      <w:r>
+        <w:rPr>
+          <w:lang w:val="fr-FR"/>
+        </w:rPr>
+        <w:t>.</w:t>
+      </w:r>
+    </w:p>
+    <w:p>
+      <w:pPr>
+        <w:jc w:val="both"/>
+        <w:rPr>
+          <w:lang w:val="fr-FR"/>
+        </w:rPr>
+      </w:pPr>
+      <w:r>
+        <w:rPr>
+          <w:lang w:val="fr-FR"/>
+        </w:rPr>
+        <w:t>Le nom de la base de données doit être « </w:t>
+      </w:r>
+      <w:r>
+        <w:rPr>
+          <w:lang w:val="fr-FR"/>
+        </w:rPr>
+        <w:t>harmogestion</w:t>
+      </w:r>
+      <w:r>
+        <w:rPr>
+          <w:lang w:val="fr-FR"/>
+        </w:rPr>
+        <w:t> ».</w:t>
+      </w:r>
+    </w:p>
+    <w:p>
+      <w:pPr>
+        <w:jc w:val="both"/>
+        <w:rPr>
+          <w:lang w:val="fr-FR"/>
+        </w:rPr>
+      </w:pPr>
+      <w:r>
+        <w:rPr>
+          <w:lang w:val="fr-FR"/>
+        </w:rPr>
+        <w:t>Afin de fonctionner pleinement, l</w:t>
+      </w:r>
+      <w:r>
+        <w:rPr>
+          <w:lang w:val="fr-FR"/>
+        </w:rPr>
+        <w:t>e fichier « </w:t>
+      </w:r>
+      <w:r>
+        <w:rPr>
+          <w:i/>
+          <w:iCs/>
+          <w:lang w:val="fr-FR"/>
+        </w:rPr>
+        <w:t>HarmoGestion_</w:t>
+      </w:r>
+      <w:r>
+        <w:rPr>
+          <w:i/>
+          <w:iCs/>
+          <w:lang w:val="fr-FR"/>
+        </w:rPr>
+        <w:t>API</w:t>
+      </w:r>
+      <w:r>
+        <w:rPr>
+          <w:i/>
+          <w:iCs/>
+          <w:lang w:val="fr-FR"/>
+        </w:rPr>
+        <w:t>/src/main/ressources/application.properties</w:t>
+      </w:r>
+      <w:r>
+        <w:rPr>
+          <w:lang w:val="fr-FR"/>
+        </w:rPr>
+        <w:t> » devra contenir la ligne « </w:t>
+      </w:r>
+      <w:r>
+        <w:rPr>
+          <w:i/>
+          <w:iCs/>
+          <w:lang w:val="fr-FR"/>
+        </w:rPr>
+        <w:t>spring.datasource.url=jdbc:mysql://localhost:3306/harmogestion</w:t>
+      </w:r>
+      <w:r>
+        <w:rPr>
+          <w:lang w:val="fr-FR"/>
+        </w:rPr>
+        <w:t> ».</w:t>
+      </w:r>
+    </w:p>
+    <w:p>
+      <w:pPr>
+        <w:jc w:val="both"/>
+        <w:rPr>
+          <w:lang w:val="fr-FR"/>
+        </w:rPr>
+      </w:pPr>
+      <w:r>
+        <w:rPr>
+          <w:lang w:val="fr-FR"/>
+        </w:rPr>
+        <w:t>Les lignes « </w:t>
+      </w:r>
+      <w:r>
+        <w:rPr>
+          <w:i/>
+          <w:iCs/>
+          <w:lang w:val="fr-FR"/>
+        </w:rPr>
+        <w:t>spring.datasource.username=${HARMOGESTION_DB_USERNAME}</w:t>
+      </w:r>
+      <w:r>
+        <w:rPr>
+          <w:lang w:val="fr-FR"/>
+        </w:rPr>
+        <w:t> » et</w:t>
+      </w:r>
+      <w:r>
+        <w:rPr>
+          <w:lang w:val="fr-FR"/>
+        </w:rPr>
+        <w:br/>
+      </w:r>
+      <w:r>
+        <w:rPr>
+          <w:lang w:val="fr-FR"/>
+        </w:rPr>
+        <w:t>« </w:t>
+      </w:r>
+      <w:r>
+        <w:rPr>
+          <w:i/>
+          <w:iCs/>
+          <w:lang w:val="fr-FR"/>
+        </w:rPr>
+        <w:t>spring.datasource.password=${HARMOGESTION_DB_PASSWORD}</w:t>
+      </w:r>
+      <w:r>
+        <w:rPr>
+          <w:lang w:val="fr-FR"/>
+        </w:rPr>
+        <w:t> » correspondent à des variables d’environnement à créer sous Windows.</w:t>
+      </w:r>
+    </w:p>
+    <w:p>
+      <w:pPr>
+        <w:jc w:val="both"/>
+        <w:rPr>
+          <w:lang w:val="fr-FR"/>
+        </w:rPr>
+      </w:pPr>
+      <w:r>
+        <w:rPr>
+          <w:lang w:val="fr-FR"/>
+        </w:rPr>
+        <w:t>HARMOGESTION_DB_USERNAME</w:t>
+      </w:r>
+      <w:r>
+        <w:rPr>
+          <w:lang w:val="fr-FR"/>
+        </w:rPr>
+        <w:t> : Nom d’utilisateur créé pour l’application.</w:t>
+      </w:r>
+    </w:p>
+    <w:p>
+      <w:pPr>
+        <w:jc w:val="both"/>
+        <w:rPr>
+          <w:lang w:val="fr-FR"/>
+        </w:rPr>
+      </w:pPr>
+      <w:r>
+        <w:rPr>
+          <w:lang w:val="fr-FR"/>
+        </w:rPr>
+        <w:t>HARMOGESTION_DB_PASSWORD</w:t>
+      </w:r>
+      <w:r>
+        <w:rPr>
+          <w:lang w:val="fr-FR"/>
+        </w:rPr>
+        <w:t> : Mot de passe dudit utilisateur.</w:t>
       </w:r>
     </w:p>
     <w:p>
@@ -593,208 +1022,6 @@
         <w:spacing w:after="160" w:line="278" w:lineRule="auto"/>
         <w:ind w:left="0"/>
         <w:jc w:val="both"/>
-        <w:rPr>
-          <w:lang w:val="fr-FR"/>
-        </w:rPr>
-      </w:pPr>
-      <w:r>
-        <w:rPr>
-          <w:lang w:val="fr-FR"/>
-        </w:rPr>
-        <w:t>L</w:t>
-      </w:r>
-      <w:r>
-        <w:rPr>
-          <w:lang w:val="fr-FR"/>
-        </w:rPr>
-        <w:t>a build peut s’effectuer depuis n’importe quel OS, du moment que celui-ci possède</w:t>
-      </w:r>
-      <w:r>
-        <w:rPr>
-          <w:lang w:val="fr-FR"/>
-        </w:rPr>
-        <w:t xml:space="preserve"> </w:t>
-      </w:r>
-      <w:r>
-        <w:rPr>
-          <w:lang w:val="fr-FR"/>
-        </w:rPr>
-        <w:t>JDK25 d’installé.</w:t>
-      </w:r>
-    </w:p>
-    <w:p>
-      <w:pPr>
-        <w:jc w:val="both"/>
-      </w:pPr>
-      <w:r>
-        <w:t>L’application doit être buildée depuis un terminal depuis son emplacement avec la commande « </w:t>
-      </w:r>
-      <w:r>
-        <w:rPr>
-          <w:i/>
-          <w:iCs/>
-        </w:rPr>
-        <w:t>mvn package</w:t>
-      </w:r>
-      <w:r>
-        <w:t> » (pour être plus fin, il serait conseillé de faire « </w:t>
-      </w:r>
-      <w:r>
-        <w:rPr>
-          <w:i/>
-          <w:iCs/>
-        </w:rPr>
-        <w:t>mvn clean package</w:t>
-      </w:r>
-      <w:r>
-        <w:t> »).</w:t>
-      </w:r>
-    </w:p>
-    <w:p>
-      <w:pPr>
-        <w:jc w:val="both"/>
-      </w:pPr>
-      <w:r>
-        <w:t xml:space="preserve">L’API n’embarquant pas son serveur d’application, contrairement à l’appli web, le fichier .jar généré devra être déployée sur un serveur d’applications comme </w:t>
-      </w:r>
-      <w:r>
-        <w:rPr>
-          <w:i/>
-          <w:iCs/>
-        </w:rPr>
-        <w:t>Tomcat</w:t>
-      </w:r>
-      <w:r>
-        <w:rPr>
-          <w:lang w:val="fr-FR"/>
-        </w:rPr>
-        <w:t xml:space="preserve"> </w:t>
-      </w:r>
-      <w:r>
-        <w:rPr>
-          <w:lang w:val="fr-FR"/>
-        </w:rPr>
-        <w:t>l.</w:t>
-      </w:r>
-    </w:p>
-    <w:p>
-      <w:pPr>
-        <w:jc w:val="both"/>
-      </w:pPr>
-    </w:p>
-    <w:p>
-      <w:pPr>
-        <w:pStyle w:val="Sous-titre"/>
-        <w:jc w:val="both"/>
-      </w:pPr>
-      <w:r>
-        <w:t>Base de données</w:t>
-      </w:r>
-      <w:r>
-        <w:t> :</w:t>
-      </w:r>
-    </w:p>
-    <w:p>
-      <w:pPr>
-        <w:jc w:val="both"/>
-        <w:rPr>
-          <w:lang w:val="fr-FR"/>
-        </w:rPr>
-      </w:pPr>
-      <w:r>
-        <w:rPr>
-          <w:lang w:val="fr-FR"/>
-        </w:rPr>
-        <w:t>L</w:t>
-      </w:r>
-      <w:r>
-        <w:rPr>
-          <w:lang w:val="fr-FR"/>
-        </w:rPr>
-        <w:t>a</w:t>
-      </w:r>
-      <w:r>
-        <w:rPr>
-          <w:lang w:val="fr-FR"/>
-        </w:rPr>
-        <w:t xml:space="preserve"> base de données doit être initialisée avec MySQL avec le script </w:t>
-      </w:r>
-      <w:r>
-        <w:rPr>
-          <w:i/>
-          <w:iCs/>
-          <w:lang w:val="fr-FR"/>
-        </w:rPr>
-        <w:t>ScriptCreationBDD.sql</w:t>
-      </w:r>
-      <w:r>
-        <w:rPr>
-          <w:lang w:val="fr-FR"/>
-        </w:rPr>
-        <w:t xml:space="preserve"> contenu dans le dossier </w:t>
-      </w:r>
-      <w:r>
-        <w:rPr>
-          <w:i/>
-          <w:iCs/>
-          <w:lang w:val="fr-FR"/>
-        </w:rPr>
-        <w:t>DossierConception/SQL</w:t>
-      </w:r>
-      <w:r>
-        <w:rPr>
-          <w:lang w:val="fr-FR"/>
-        </w:rPr>
-        <w:t xml:space="preserve"> du repository </w:t>
-      </w:r>
-      <w:r>
-        <w:rPr>
-          <w:i/>
-          <w:iCs/>
-          <w:lang w:val="fr-FR"/>
-        </w:rPr>
-        <w:t>HarmoGestion_web</w:t>
-      </w:r>
-      <w:r>
-        <w:rPr>
-          <w:lang w:val="fr-FR"/>
-        </w:rPr>
-        <w:t>.</w:t>
-      </w:r>
-    </w:p>
-    <w:p>
-      <w:pPr>
-        <w:jc w:val="both"/>
-        <w:rPr>
-          <w:lang w:val="fr-FR"/>
-        </w:rPr>
-      </w:pPr>
-      <w:r>
-        <w:rPr>
-          <w:lang w:val="fr-FR"/>
-        </w:rPr>
-        <w:t xml:space="preserve">L’id user et le password user utilisé par l’API, ainsi que l’URL vers la BDD, seront à renseigner dans le fichier </w:t>
-      </w:r>
-      <w:r>
-        <w:rPr>
-          <w:i/>
-          <w:iCs/>
-          <w:lang w:val="fr-FR"/>
-        </w:rPr>
-        <w:t>data.properties</w:t>
-      </w:r>
-      <w:r>
-        <w:rPr>
-          <w:lang w:val="fr-FR"/>
-        </w:rPr>
-        <w:t xml:space="preserve"> à la racine du projet.</w:t>
-      </w:r>
-    </w:p>
-    <w:p>
-      <w:pPr>
-        <w:jc w:val="both"/>
-      </w:pPr>
-      <w:r>
         <w:rPr>
           <w:b/>
           <w:bCs/>
@@ -802,8 +1029,7 @@
           <w:highlight w:val="red"/>
           <w:lang w:val="fr-FR"/>
         </w:rPr>
-        <w:t>/!</w:t>
-      </w:r>
+      </w:pPr>
       <w:r>
         <w:rPr>
           <w:b/>
@@ -812,7 +1038,7 @@
           <w:highlight w:val="red"/>
           <w:lang w:val="fr-FR"/>
         </w:rPr>
-        <w:t>\ La bonne pratique veut que le compte utilisé par l’API ai le moins d’autorisations possible un fois en production. /!</w:t>
+        <w:t>/!\</w:t>
       </w:r>
       <w:r>
         <w:rPr>
@@ -822,7 +1048,259 @@
           <w:highlight w:val="red"/>
           <w:lang w:val="fr-FR"/>
         </w:rPr>
+        <w:t xml:space="preserve"> </w:t>
+      </w:r>
+      <w:r>
+        <w:rPr>
+          <w:b/>
+          <w:bCs/>
+          <w:color w:val="FFFFFF" w:themeColor="background1"/>
+          <w:highlight w:val="red"/>
+          <w:lang w:val="fr-FR"/>
+        </w:rPr>
+        <w:t>Privilégier un utilisateur avec le minimum de droit (select, insert, delete, update)</w:t>
+      </w:r>
+      <w:r>
+        <w:rPr>
+          <w:b/>
+          <w:bCs/>
+          <w:color w:val="FFFFFF" w:themeColor="background1"/>
+          <w:highlight w:val="red"/>
+          <w:lang w:val="fr-FR"/>
+        </w:rPr>
+        <w:t xml:space="preserve"> /!</w:t>
+      </w:r>
+      <w:r>
+        <w:rPr>
+          <w:b/>
+          <w:bCs/>
+          <w:color w:val="FFFFFF" w:themeColor="background1"/>
+          <w:highlight w:val="red"/>
+          <w:lang w:val="fr-FR"/>
+        </w:rPr>
         <w:t>\</w:t>
+      </w:r>
+    </w:p>
+    <w:p>
+      <w:pPr>
+        <w:jc w:val="both"/>
+      </w:pPr>
+    </w:p>
+    <w:p>
+      <w:pPr>
+        <w:pStyle w:val="Sous-titre"/>
+        <w:jc w:val="both"/>
+      </w:pPr>
+      <w:r>
+        <w:t>Build du projet :</w:t>
+      </w:r>
+    </w:p>
+    <w:p>
+      <w:pPr>
+        <w:pStyle w:val="Paragraphedeliste"/>
+        <w:spacing w:after="160" w:line="278" w:lineRule="auto"/>
+        <w:ind w:left="0"/>
+        <w:jc w:val="both"/>
+        <w:rPr>
+          <w:lang w:val="fr-FR"/>
+        </w:rPr>
+      </w:pPr>
+      <w:r>
+        <w:rPr>
+          <w:lang w:val="fr-FR"/>
+        </w:rPr>
+        <w:t>L</w:t>
+      </w:r>
+      <w:r>
+        <w:rPr>
+          <w:lang w:val="fr-FR"/>
+        </w:rPr>
+        <w:t>a build peut s’effectuer depuis n’importe quel OS, du moment que celui-ci possède JDK25 et Maven d’installés. Le build depuis la racine du projet peut être effectuer avec la commande « </w:t>
+      </w:r>
+      <w:r>
+        <w:rPr>
+          <w:i/>
+          <w:iCs/>
+          <w:lang w:val="fr-FR"/>
+        </w:rPr>
+        <w:t>mvn clean package</w:t>
+      </w:r>
+      <w:r>
+        <w:rPr>
+          <w:lang w:val="fr-FR"/>
+        </w:rPr>
+        <w:t> ».</w:t>
+      </w:r>
+    </w:p>
+    <w:p>
+      <w:pPr>
+        <w:pStyle w:val="Paragraphedeliste"/>
+        <w:spacing w:after="160" w:line="278" w:lineRule="auto"/>
+        <w:ind w:left="0"/>
+        <w:jc w:val="both"/>
+        <w:rPr>
+          <w:lang w:val="fr-FR"/>
+        </w:rPr>
+      </w:pPr>
+      <w:r>
+        <w:rPr>
+          <w:lang w:val="fr-FR"/>
+        </w:rPr>
+        <w:t>Le build du projet en .JAR du projet sera disponible dans le dossier « </w:t>
+      </w:r>
+      <w:r>
+        <w:rPr>
+          <w:i/>
+          <w:iCs/>
+          <w:lang w:val="fr-FR"/>
+        </w:rPr>
+        <w:t>target</w:t>
+      </w:r>
+      <w:r>
+        <w:rPr>
+          <w:lang w:val="fr-FR"/>
+        </w:rPr>
+        <w:t> » du projet.</w:t>
+      </w:r>
+    </w:p>
+    <w:p>
+      <w:pPr>
+        <w:pStyle w:val="Paragraphedeliste"/>
+        <w:spacing w:after="160" w:line="278" w:lineRule="auto"/>
+        <w:ind w:left="0"/>
+        <w:jc w:val="both"/>
+      </w:pPr>
+    </w:p>
+    <w:p>
+      <w:pPr>
+        <w:pStyle w:val="Sous-titre"/>
+        <w:jc w:val="both"/>
+      </w:pPr>
+      <w:r>
+        <w:t>Lancement</w:t>
+      </w:r>
+      <w:r>
+        <w:t xml:space="preserve"> de l’API :</w:t>
+      </w:r>
+    </w:p>
+    <w:p>
+      <w:pPr>
+        <w:pStyle w:val="Paragraphedeliste"/>
+        <w:spacing w:after="160" w:line="278" w:lineRule="auto"/>
+        <w:ind w:left="0"/>
+        <w:jc w:val="both"/>
+        <w:rPr>
+          <w:lang w:val="fr-FR"/>
+        </w:rPr>
+      </w:pPr>
+      <w:r>
+        <w:rPr>
+          <w:lang w:val="fr-FR"/>
+        </w:rPr>
+        <w:t>Le lancement se fait avec la commande « </w:t>
+      </w:r>
+      <w:r>
+        <w:rPr>
+          <w:i/>
+          <w:iCs/>
+          <w:lang w:val="fr-FR"/>
+        </w:rPr>
+        <w:t>mvn spring-boot:run</w:t>
+      </w:r>
+      <w:r>
+        <w:rPr>
+          <w:lang w:val="fr-FR"/>
+        </w:rPr>
+        <w:t xml:space="preserve"> » dans un terminal. Pour clore </w:t>
+      </w:r>
+      <w:r>
+        <w:rPr>
+          <w:lang w:val="fr-FR"/>
+        </w:rPr>
+        <w:t>l’API</w:t>
+      </w:r>
+      <w:r>
+        <w:rPr>
+          <w:lang w:val="fr-FR"/>
+        </w:rPr>
+        <w:t>, il faudra faire Ctrl+C sur le clavier et confirmer la fermeture.</w:t>
+      </w:r>
+    </w:p>
+    <w:p>
+      <w:pPr>
+        <w:pStyle w:val="Paragraphedeliste"/>
+        <w:spacing w:after="160" w:line="278" w:lineRule="auto"/>
+        <w:ind w:left="0"/>
+        <w:jc w:val="both"/>
+        <w:rPr>
+          <w:lang w:val="fr-FR"/>
+        </w:rPr>
+      </w:pPr>
+      <w:r>
+        <w:rPr>
+          <w:lang w:val="fr-FR"/>
+        </w:rPr>
+        <w:t xml:space="preserve">Le port utilisé par </w:t>
+      </w:r>
+      <w:r>
+        <w:rPr>
+          <w:lang w:val="fr-FR"/>
+        </w:rPr>
+        <w:t>l’API</w:t>
+      </w:r>
+      <w:r>
+        <w:rPr>
+          <w:lang w:val="fr-FR"/>
+        </w:rPr>
+        <w:t xml:space="preserve"> est le 900</w:t>
+      </w:r>
+      <w:r>
+        <w:rPr>
+          <w:lang w:val="fr-FR"/>
+        </w:rPr>
+        <w:t>2</w:t>
+      </w:r>
+      <w:r>
+        <w:rPr>
+          <w:lang w:val="fr-FR"/>
+        </w:rPr>
+        <w:t xml:space="preserve"> (modifiable dans le fichier « </w:t>
+      </w:r>
+      <w:r>
+        <w:rPr>
+          <w:i/>
+          <w:iCs/>
+          <w:lang w:val="fr-FR"/>
+        </w:rPr>
+        <w:t>HarmoGestion_web/src/main/ressources/application.properties</w:t>
+      </w:r>
+      <w:r>
+        <w:rPr>
+          <w:lang w:val="fr-FR"/>
+        </w:rPr>
+        <w:t xml:space="preserve"> »). </w:t>
+      </w:r>
+      <w:r>
+        <w:rPr>
+          <w:lang w:val="fr-FR"/>
+        </w:rPr>
+        <w:t>N’ayant pas d’interface graphique, son fonctionnement peut pour l’instant être vérifié via Postman (en lui indiquant l’adresse « </w:t>
+      </w:r>
+      <w:r>
+        <w:rPr>
+          <w:i/>
+          <w:iCs/>
+        </w:rPr>
+        <w:t>localhost:9002</w:t>
+      </w:r>
+      <w:r>
+        <w:t> »</w:t>
+      </w:r>
+      <w:r>
+        <w:rPr>
+          <w:lang w:val="fr-FR"/>
+        </w:rPr>
+        <w:t>) ou la partie web d’HarmoGestion.</w:t>
       </w:r>
     </w:p>
     <w:sectPr>

</xml_diff>